<commit_message>
uv update - troparia
</commit_message>
<xml_diff>
--- a/flow/20230914_vu_template/drafts/2023-11-g/02-ЧТ-мчч. Акиндина та ін..docx
+++ b/flow/20230914_vu_template/drafts/2023-11-g/02-ЧТ-мчч. Акиндина та ін..docx
@@ -5774,95 +5774,6 @@
       </w:r>
     </w:p>
     <w:p>
-      <w:pPr>
-        <w:spacing w:after="120" w:lineRule="auto"/>
-        <w:jc w:val="both"/>
-        <w:rPr>
-          <w:rFonts w:ascii="Times New Roman" w:cs="Times New Roman" w:eastAsia="Times New Roman" w:hAnsi="Times New Roman"/>
-          <w:sz w:val="24"/>
-          <w:szCs w:val="24"/>
-        </w:rPr>
-      </w:pPr>
-      <w:r>
-        <w:rPr>
-          <w:rtl w:val="0"/>
-        </w:rPr>
-      </w:r>
-    </w:p>
-    <w:p>
-      <w:pPr>
-        <w:spacing w:after="120" w:lineRule="auto"/>
-        <w:jc w:val="both"/>
-        <w:rPr>
-          <w:rFonts w:ascii="Times New Roman" w:cs="Times New Roman" w:eastAsia="Times New Roman" w:hAnsi="Times New Roman"/>
-          <w:sz w:val="24"/>
-          <w:szCs w:val="24"/>
-        </w:rPr>
-      </w:pPr>
-      <w:r>
-        <w:rPr>
-          <w:rFonts w:ascii="Times New Roman" w:cs="Times New Roman" w:eastAsia="Times New Roman" w:hAnsi="Times New Roman"/>
-          <w:i w:val="1"/>
-          <w:color w:val="ff0000"/>
-          <w:sz w:val="24"/>
-          <w:szCs w:val="24"/>
-          <w:rtl w:val="0"/>
-        </w:rPr>
-        <w:t xml:space="preserve">тропар</w:t>
-      </w:r>
-      <w:r>
-        <w:rPr>
-          <w:rtl w:val="0"/>
-        </w:rPr>
-      </w:r>
-    </w:p>
-    <w:p>
-      <w:pPr>
-        <w:spacing w:after="120" w:lineRule="auto"/>
-        <w:jc w:val="both"/>
-        <w:rPr>
-          <w:rFonts w:ascii="Times New Roman" w:cs="Times New Roman" w:eastAsia="Times New Roman" w:hAnsi="Times New Roman"/>
-          <w:sz w:val="24"/>
-          <w:szCs w:val="24"/>
-        </w:rPr>
-      </w:pPr>
-      <w:r>
-        <w:rPr>
-          <w:rFonts w:ascii="Times New Roman" w:cs="Times New Roman" w:eastAsia="Times New Roman" w:hAnsi="Times New Roman"/>
-          <w:b w:val="1"/>
-          <w:sz w:val="24"/>
-          <w:szCs w:val="24"/>
-          <w:rtl w:val="0"/>
-        </w:rPr>
-        <w:t xml:space="preserve">Слава: і нині:</w:t>
-      </w:r>
-      <w:r>
-        <w:rPr>
-          <w:rFonts w:ascii="Times New Roman" w:cs="Times New Roman" w:eastAsia="Times New Roman" w:hAnsi="Times New Roman"/>
-          <w:sz w:val="24"/>
-          <w:szCs w:val="24"/>
-          <w:rtl w:val="0"/>
-        </w:rPr>
-        <w:t xml:space="preserve"> </w:t>
-      </w:r>
-    </w:p>
-    <w:p>
-      <w:pPr>
-        <w:spacing w:after="120" w:lineRule="auto"/>
-        <w:jc w:val="both"/>
-        <w:rPr>
-          <w:rFonts w:ascii="Times New Roman" w:cs="Times New Roman" w:eastAsia="Times New Roman" w:hAnsi="Times New Roman"/>
-          <w:sz w:val="24"/>
-          <w:szCs w:val="24"/>
-        </w:rPr>
-      </w:pPr>
-      <w:r>
-        <w:rPr>
-          <w:rtl w:val="0"/>
-        </w:rPr>
-      </w:r>
-    </w:p>
-    <w:p>
       <w:pPr/>
       <w:r>
         <w:rPr>
@@ -5902,7 +5813,9 @@
       <w:pPr/>
       <w:r>
         <w:rPr>
+          <w:rFonts w:ascii="Times New Roman" w:hAnsi="Times New Roman"/>
           <w:b/>
+          <w:sz w:val="24"/>
         </w:rPr>
         <w:t xml:space="preserve">Слава, і нині: </w:t>
       </w:r>
@@ -5910,6 +5823,9 @@
         <w:rPr/>
         <w:t>богородичний</w:t>
       </w:r>
+    </w:p>
+    <w:p>
+      <w:pPr/>
     </w:p>
     <w:p>
       <w:pPr>
@@ -11066,138 +10982,6 @@
       </w:r>
     </w:p>
     <w:p>
-      <w:pPr>
-        <w:spacing w:after="120" w:lineRule="auto"/>
-        <w:jc w:val="both"/>
-        <w:rPr>
-          <w:rFonts w:ascii="Times New Roman" w:cs="Times New Roman" w:eastAsia="Times New Roman" w:hAnsi="Times New Roman"/>
-          <w:b w:val="1"/>
-          <w:sz w:val="24"/>
-          <w:szCs w:val="24"/>
-        </w:rPr>
-      </w:pPr>
-      <w:r>
-        <w:rPr>
-          <w:rtl w:val="0"/>
-        </w:rPr>
-      </w:r>
-    </w:p>
-    <w:p>
-      <w:pPr>
-        <w:spacing w:after="120" w:lineRule="auto"/>
-        <w:jc w:val="both"/>
-        <w:rPr>
-          <w:rFonts w:ascii="Times New Roman" w:cs="Times New Roman" w:eastAsia="Times New Roman" w:hAnsi="Times New Roman"/>
-          <w:i w:val="1"/>
-          <w:sz w:val="24"/>
-          <w:szCs w:val="24"/>
-        </w:rPr>
-      </w:pPr>
-      <w:r>
-        <w:rPr>
-          <w:rFonts w:ascii="Times New Roman" w:cs="Times New Roman" w:eastAsia="Times New Roman" w:hAnsi="Times New Roman"/>
-          <w:b w:val="1"/>
-          <w:sz w:val="24"/>
-          <w:szCs w:val="24"/>
-          <w:rtl w:val="0"/>
-        </w:rPr>
-        <w:t xml:space="preserve">Слава: </w:t>
-      </w:r>
-      <w:r>
-        <w:rPr>
-          <w:rtl w:val="0"/>
-        </w:rPr>
-      </w:r>
-    </w:p>
-    <w:p>
-      <w:pPr>
-        <w:spacing w:after="120" w:lineRule="auto"/>
-        <w:jc w:val="both"/>
-        <w:rPr>
-          <w:rFonts w:ascii="Times New Roman" w:cs="Times New Roman" w:eastAsia="Times New Roman" w:hAnsi="Times New Roman"/>
-          <w:sz w:val="24"/>
-          <w:szCs w:val="24"/>
-        </w:rPr>
-      </w:pPr>
-      <w:r>
-        <w:rPr>
-          <w:rFonts w:ascii="Times New Roman" w:cs="Times New Roman" w:eastAsia="Times New Roman" w:hAnsi="Times New Roman"/>
-          <w:b w:val="1"/>
-          <w:sz w:val="24"/>
-          <w:szCs w:val="24"/>
-          <w:rtl w:val="0"/>
-        </w:rPr>
-        <w:t xml:space="preserve">І нині:</w:t>
-      </w:r>
-      <w:r>
-        <w:rPr>
-          <w:rFonts w:ascii="Times New Roman" w:cs="Times New Roman" w:eastAsia="Times New Roman" w:hAnsi="Times New Roman"/>
-          <w:sz w:val="24"/>
-          <w:szCs w:val="24"/>
-          <w:rtl w:val="0"/>
-        </w:rPr>
-        <w:t xml:space="preserve"> </w:t>
-      </w:r>
-    </w:p>
-    <w:p>
-      <w:pPr>
-        <w:spacing w:after="120" w:lineRule="auto"/>
-        <w:jc w:val="both"/>
-        <w:rPr>
-          <w:rFonts w:ascii="Times New Roman" w:cs="Times New Roman" w:eastAsia="Times New Roman" w:hAnsi="Times New Roman"/>
-          <w:sz w:val="24"/>
-          <w:szCs w:val="24"/>
-        </w:rPr>
-      </w:pPr>
-      <w:r>
-        <w:rPr>
-          <w:rtl w:val="0"/>
-        </w:rPr>
-      </w:r>
-    </w:p>
-    <w:p>
-      <w:pPr>
-        <w:spacing w:after="120" w:lineRule="auto"/>
-        <w:jc w:val="both"/>
-        <w:rPr>
-          <w:rFonts w:ascii="Times New Roman" w:cs="Times New Roman" w:eastAsia="Times New Roman" w:hAnsi="Times New Roman"/>
-          <w:i w:val="1"/>
-          <w:color w:val="ff0000"/>
-          <w:sz w:val="24"/>
-          <w:szCs w:val="24"/>
-        </w:rPr>
-      </w:pPr>
-      <w:r>
-        <w:rPr>
-          <w:rFonts w:ascii="Times New Roman" w:cs="Times New Roman" w:eastAsia="Times New Roman" w:hAnsi="Times New Roman"/>
-          <w:i w:val="1"/>
-          <w:color w:val="ff0000"/>
-          <w:sz w:val="24"/>
-          <w:szCs w:val="24"/>
-          <w:rtl w:val="0"/>
-        </w:rPr>
-        <w:t xml:space="preserve">По тропарях читає читець чергову катизму, після якої диякон перед св. дверми виголошує:</w:t>
-      </w:r>
-    </w:p>
-    <w:p>
-      <w:pPr>
-        <w:spacing w:after="120" w:lineRule="auto"/>
-        <w:jc w:val="both"/>
-        <w:rPr>
-          <w:rFonts w:ascii="Times New Roman" w:cs="Times New Roman" w:eastAsia="Times New Roman" w:hAnsi="Times New Roman"/>
-          <w:i w:val="1"/>
-          <w:color w:val="000000"/>
-          <w:sz w:val="24"/>
-          <w:szCs w:val="24"/>
-        </w:rPr>
-      </w:pPr>
-      <w:r>
-        <w:rPr>
-          <w:rtl w:val="0"/>
-        </w:rPr>
-      </w:r>
-    </w:p>
-    <w:p>
       <w:pPr/>
       <w:r>
         <w:rPr>
@@ -11237,7 +11021,9 @@
       <w:pPr/>
       <w:r>
         <w:rPr>
+          <w:rFonts w:ascii="Times New Roman" w:hAnsi="Times New Roman"/>
           <w:b/>
+          <w:sz w:val="24"/>
         </w:rPr>
         <w:t xml:space="preserve">Слава, і нині: </w:t>
       </w:r>
@@ -11245,6 +11031,9 @@
         <w:rPr/>
         <w:t>богородичний</w:t>
       </w:r>
+    </w:p>
+    <w:p>
+      <w:pPr/>
     </w:p>
     <w:p>
       <w:pPr>
@@ -17312,38 +17101,6 @@
       </w:r>
     </w:p>
     <w:p>
-      <w:pPr>
-        <w:spacing w:after="120" w:lineRule="auto"/>
-        <w:jc w:val="both"/>
-        <w:rPr>
-          <w:rFonts w:ascii="Times New Roman" w:cs="Times New Roman" w:eastAsia="Times New Roman" w:hAnsi="Times New Roman"/>
-          <w:sz w:val="24"/>
-          <w:szCs w:val="24"/>
-        </w:rPr>
-      </w:pPr>
-      <w:r>
-        <w:rPr>
-          <w:rtl w:val="0"/>
-        </w:rPr>
-      </w:r>
-    </w:p>
-    <w:p>
-      <w:pPr>
-        <w:spacing w:after="120" w:lineRule="auto"/>
-        <w:jc w:val="both"/>
-        <w:rPr>
-          <w:rFonts w:ascii="Times New Roman" w:cs="Times New Roman" w:eastAsia="Times New Roman" w:hAnsi="Times New Roman"/>
-          <w:sz w:val="24"/>
-          <w:szCs w:val="24"/>
-        </w:rPr>
-      </w:pPr>
-      <w:r>
-        <w:rPr>
-          <w:rtl w:val="0"/>
-        </w:rPr>
-      </w:r>
-    </w:p>
-    <w:p>
       <w:pPr/>
       <w:r>
         <w:rPr>
@@ -17383,7 +17140,9 @@
       <w:pPr/>
       <w:r>
         <w:rPr>
+          <w:rFonts w:ascii="Times New Roman" w:hAnsi="Times New Roman"/>
           <w:b/>
+          <w:sz w:val="24"/>
         </w:rPr>
         <w:t xml:space="preserve">Слава, і нині: </w:t>
       </w:r>
@@ -17391,6 +17150,9 @@
         <w:rPr/>
         <w:t>богородичний</w:t>
       </w:r>
+    </w:p>
+    <w:p>
+      <w:pPr/>
     </w:p>
     <w:p>
       <w:pPr>

</xml_diff>